<commit_message>
Update meeting agenda template .docx files (burgundy & navy, A4 & letter)
</commit_message>
<xml_diff>
--- a/skills/toastmasters-meeting-agenda-team/assets/toastmasters-645B-meeting-agenda-burgundy-A4.docx
+++ b/skills/toastmasters-meeting-agenda-team/assets/toastmasters-645B-meeting-agenda-burgundy-A4.docx
@@ -1,8 +1,8 @@
 
 <file path=word/document.xml><?xml version="1.0" encoding="utf-8"?>
-<w:document xmlns:wpc="http://schemas.microsoft.com/office/word/2010/wordprocessingCanvas" xmlns:cx="http://schemas.microsoft.com/office/drawing/2014/chartex" xmlns:cx1="http://schemas.microsoft.com/office/drawing/2015/9/8/chartex" xmlns:cx2="http://schemas.microsoft.com/office/drawing/2015/10/21/chartex" xmlns:cx3="http://schemas.microsoft.com/office/drawing/2016/5/9/chartex" xmlns:cx4="http://schemas.microsoft.com/office/drawing/2016/5/10/chartex" xmlns:cx5="http://schemas.microsoft.com/office/drawing/2016/5/11/chartex" xmlns:cx6="http://schemas.microsoft.com/office/drawing/2016/5/12/chartex" xmlns:cx7="http://schemas.microsoft.com/office/drawing/2016/5/13/chartex" xmlns:cx8="http://schemas.microsoft.com/office/drawing/2016/5/14/chartex" xmlns:mc="http://schemas.openxmlformats.org/markup-compatibility/2006" xmlns:aink="http://schemas.microsoft.com/office/drawing/2016/ink" xmlns:am3d="http://schemas.microsoft.com/office/drawing/2017/model3d" xmlns:o="urn:schemas-microsoft-com:office:office" xmlns:r="http://schemas.openxmlformats.org/officeDocument/2006/relationships" xmlns:m="http://schemas.openxmlformats.org/officeDocument/2006/math" xmlns:v="urn:schemas-microsoft-com:vml" xmlns:wp14="http://schemas.microsoft.com/office/word/2010/wordprocessingDrawing" xmlns:wp="http://schemas.openxmlformats.org/drawingml/2006/wordprocessingDrawing" xmlns:w10="urn:schemas-microsoft-com:office:word" xmlns:w="http://schemas.openxmlformats.org/wordprocessingml/2006/main" xmlns:w14="http://schemas.microsoft.com/office/word/2010/wordml" xmlns:w15="http://schemas.microsoft.com/office/word/2012/wordml" xmlns:w16cid="http://schemas.microsoft.com/office/word/2016/wordml/cid" xmlns:w16se="http://schemas.microsoft.com/office/word/2015/wordml/symex" xmlns:wpg="http://schemas.microsoft.com/office/word/2010/wordprocessingGroup" xmlns:wpi="http://schemas.microsoft.com/office/word/2010/wordprocessingInk" xmlns:wne="http://schemas.microsoft.com/office/word/2006/wordml" xmlns:wps="http://schemas.microsoft.com/office/word/2010/wordprocessingShape" mc:Ignorable="w14 w15 w16se w16cid wp14">
+<w:document xmlns:ns1="http://schemas.openxmlformats.org/markup-compatibility/2006" xmlns:ns10="urn:schemas-microsoft-com:office:office" xmlns:ns11="urn:schemas-microsoft-com:office:word" xmlns:ns2="http://schemas.microsoft.com/office/word/2010/wordml" xmlns:ns4="http://schemas.openxmlformats.org/drawingml/2006/wordprocessingDrawing" xmlns:ns5="http://schemas.microsoft.com/office/word/2010/wordprocessingDrawing" xmlns:ns6="http://schemas.openxmlformats.org/drawingml/2006/main" xmlns:ns7="http://schemas.microsoft.com/office/word/2010/wordprocessingShape" xmlns:ns8="http://schemas.microsoft.com/office/drawing/2010/main" xmlns:ns9="urn:schemas-microsoft-com:vml" xmlns:r="http://schemas.openxmlformats.org/officeDocument/2006/relationships" xmlns:w="http://schemas.openxmlformats.org/wordprocessingml/2006/main" ns1:Ignorable="w14 w15 w16se w16cid wp14">
   <w:body>
-    <w:p>
+    <w:p ns2:paraId="1A98360B" ns2:textId="77777777">
       <w:pPr>
         <w:spacing w:before="374"/>
         <w:ind w:right="374"/>
@@ -18,7 +18,7 @@
           <w:color w:val="FFFFFF"/>
           <w:sz w:val="40"/>
         </w:rPr>
-        <w:t>Club Name Club</w:t>
+        <w:t>{Club} {No}</w:t>
       </w:r>
       <w:r>
         <w:rPr>
@@ -27,7 +27,7 @@
           <w:spacing w:val="-5"/>
           <w:sz w:val="40"/>
         </w:rPr>
-        <w:t xml:space="preserve"> </w:t>
+        <w:t xml:space="preserve"/>
       </w:r>
       <w:r>
         <w:rPr>
@@ -35,10 +35,10 @@
           <w:color w:val="FFFFFF"/>
           <w:sz w:val="40"/>
         </w:rPr>
-        <w:t>Number</w:t>
-      </w:r>
-    </w:p>
-    <w:p>
+        <w:t/>
+      </w:r>
+    </w:p>
+    <w:p ns2:paraId="5C5E143E" ns2:textId="77777777">
       <w:pPr>
         <w:spacing w:before="133"/>
         <w:ind w:right="383"/>
@@ -52,7 +52,7 @@
           <w:color w:val="FFFFFF"/>
           <w:sz w:val="28"/>
         </w:rPr>
-        <w:t>Club Meeting</w:t>
+        <w:t>{Theme}</w:t>
       </w:r>
       <w:r>
         <w:rPr>
@@ -60,17 +60,17 @@
           <w:spacing w:val="-13"/>
           <w:sz w:val="28"/>
         </w:rPr>
-        <w:t xml:space="preserve"> </w:t>
+        <w:t xml:space="preserve"/>
       </w:r>
       <w:r>
         <w:rPr>
           <w:color w:val="FFFFFF"/>
           <w:sz w:val="28"/>
         </w:rPr>
-        <w:t>Theme</w:t>
-      </w:r>
-    </w:p>
-    <w:p>
+        <w:t/>
+      </w:r>
+    </w:p>
+    <w:p ns2:paraId="58E8DC66" ns2:textId="66B23C15">
       <w:pPr>
         <w:pStyle w:val="BodyText"/>
         <w:ind w:left="109"/>
@@ -80,7 +80,7 @@
         </w:rPr>
       </w:pPr>
     </w:p>
-    <w:p>
+    <w:p ns2:paraId="5EB7DEB9" ns2:textId="4EE84B07">
       <w:pPr>
         <w:pStyle w:val="BodyText"/>
         <w:ind w:left="109"/>
@@ -90,7 +90,7 @@
         </w:rPr>
       </w:pPr>
     </w:p>
-    <w:p>
+    <w:p ns2:paraId="5C6F2F4C" ns2:textId="77777777">
       <w:pPr>
         <w:pStyle w:val="BodyText"/>
         <w:spacing w:before="3"/>
@@ -100,7 +100,7 @@
         </w:rPr>
       </w:pPr>
     </w:p>
-    <w:p>
+    <w:p ns2:paraId="30766129" ns2:textId="77777777">
       <w:pPr>
         <w:rPr>
           <w:rFonts w:ascii="Times New Roman"/>
@@ -120,16 +120,16 @@
         </w:sectPr>
       </w:pPr>
     </w:p>
-    <w:p>
+    <w:p ns2:paraId="487A209C" ns2:textId="77777777">
       <w:pPr>
         <w:pStyle w:val="Heading1"/>
         <w:spacing w:before="93"/>
       </w:pPr>
       <w:r>
-        <w:t>Month, Day YYYY</w:t>
-      </w:r>
-    </w:p>
-    <w:p>
+        <w:t>{Date}</w:t>
+      </w:r>
+    </w:p>
+    <w:p ns2:paraId="1041DBCA" ns2:textId="77777777">
       <w:pPr>
         <w:pStyle w:val="BodyText"/>
         <w:spacing w:before="4"/>
@@ -139,7 +139,7 @@
         </w:rPr>
       </w:pPr>
     </w:p>
-    <w:p>
+    <w:p ns2:paraId="49998310" ns2:textId="77777777">
       <w:pPr>
         <w:ind w:left="540"/>
         <w:rPr>
@@ -154,17 +154,17 @@
         <w:t>President</w:t>
       </w:r>
     </w:p>
-    <w:p>
+    <w:p ns2:paraId="2145DCDF" ns2:textId="77777777">
       <w:pPr>
         <w:pStyle w:val="BodyText"/>
         <w:spacing w:before="2"/>
         <w:ind w:left="540"/>
       </w:pPr>
       <w:r>
-        <w:t>Jane Doe</w:t>
-      </w:r>
-    </w:p>
-    <w:p>
+        <w:t>{Pres}</w:t>
+      </w:r>
+    </w:p>
+    <w:p ns2:paraId="10372B9C" ns2:textId="77777777">
       <w:pPr>
         <w:pStyle w:val="BodyText"/>
         <w:spacing w:before="1"/>
@@ -173,7 +173,7 @@
         </w:rPr>
       </w:pPr>
     </w:p>
-    <w:p>
+    <w:p ns2:paraId="2F90B5EC" ns2:textId="77777777">
       <w:pPr>
         <w:pStyle w:val="Heading1"/>
         <w:spacing w:line="251" w:lineRule="exact"/>
@@ -185,17 +185,17 @@
         <w:t>VP Education</w:t>
       </w:r>
     </w:p>
-    <w:p>
+    <w:p ns2:paraId="5D9FE5B1" ns2:textId="77777777">
       <w:pPr>
         <w:pStyle w:val="BodyText"/>
         <w:spacing w:line="251" w:lineRule="exact"/>
         <w:ind w:left="540"/>
       </w:pPr>
       <w:r>
-        <w:t>John Doe</w:t>
-      </w:r>
-    </w:p>
-    <w:p>
+        <w:t>{VPE}</w:t>
+      </w:r>
+    </w:p>
+    <w:p ns2:paraId="5A3B91AA" ns2:textId="77777777">
       <w:pPr>
         <w:pStyle w:val="BodyText"/>
         <w:rPr>
@@ -203,7 +203,7 @@
         </w:rPr>
       </w:pPr>
     </w:p>
-    <w:p>
+    <w:p ns2:paraId="3A5002D8" ns2:textId="77777777">
       <w:pPr>
         <w:pStyle w:val="Heading1"/>
         <w:spacing w:before="1" w:line="251" w:lineRule="exact"/>
@@ -215,17 +215,17 @@
         <w:t>VP Membership</w:t>
       </w:r>
     </w:p>
-    <w:p>
+    <w:p ns2:paraId="2A89FB60" ns2:textId="77777777">
       <w:pPr>
         <w:pStyle w:val="BodyText"/>
         <w:spacing w:line="251" w:lineRule="exact"/>
         <w:ind w:left="540"/>
       </w:pPr>
       <w:r>
-        <w:t>Jane Doe</w:t>
-      </w:r>
-    </w:p>
-    <w:p>
+        <w:t>{VPM}</w:t>
+      </w:r>
+    </w:p>
+    <w:p ns2:paraId="0A7D62BA" ns2:textId="77777777">
       <w:pPr>
         <w:pStyle w:val="BodyText"/>
         <w:rPr>
@@ -233,7 +233,7 @@
         </w:rPr>
       </w:pPr>
     </w:p>
-    <w:p>
+    <w:p ns2:paraId="07412CAD" ns2:textId="77777777">
       <w:pPr>
         <w:pStyle w:val="Heading1"/>
         <w:spacing w:before="1"/>
@@ -245,17 +245,17 @@
         <w:t>VP Public Relations</w:t>
       </w:r>
     </w:p>
-    <w:p>
+    <w:p ns2:paraId="6A5B97AD" ns2:textId="77777777">
       <w:pPr>
         <w:pStyle w:val="BodyText"/>
         <w:spacing w:before="2"/>
         <w:ind w:left="540"/>
       </w:pPr>
       <w:r>
-        <w:t>Jane Doe</w:t>
-      </w:r>
-    </w:p>
-    <w:p>
+        <w:t>{VPPR}</w:t>
+      </w:r>
+    </w:p>
+    <w:p ns2:paraId="56D6B5D7" ns2:textId="77777777">
       <w:pPr>
         <w:pStyle w:val="BodyText"/>
         <w:spacing w:before="6"/>
@@ -264,7 +264,7 @@
         </w:rPr>
       </w:pPr>
     </w:p>
-    <w:p>
+    <w:p ns2:paraId="060AEBD3" ns2:textId="77777777">
       <w:pPr>
         <w:pStyle w:val="Heading1"/>
         <w:spacing w:before="1"/>
@@ -276,17 +276,17 @@
         <w:t>Secretary</w:t>
       </w:r>
     </w:p>
-    <w:p>
+    <w:p ns2:paraId="6C05B4A6" ns2:textId="77777777">
       <w:pPr>
         <w:pStyle w:val="BodyText"/>
         <w:spacing w:before="2"/>
         <w:ind w:left="540"/>
       </w:pPr>
       <w:r>
-        <w:t>John Doe</w:t>
-      </w:r>
-    </w:p>
-    <w:p>
+        <w:t>{Sec}</w:t>
+      </w:r>
+    </w:p>
+    <w:p ns2:paraId="31F02A95" ns2:textId="77777777">
       <w:pPr>
         <w:pStyle w:val="BodyText"/>
         <w:spacing w:before="7"/>
@@ -295,7 +295,7 @@
         </w:rPr>
       </w:pPr>
     </w:p>
-    <w:p>
+    <w:p ns2:paraId="659E6DB8" ns2:textId="77777777">
       <w:pPr>
         <w:pStyle w:val="Heading1"/>
       </w:pPr>
@@ -306,17 +306,17 @@
         <w:t>Treasurer</w:t>
       </w:r>
     </w:p>
-    <w:p>
+    <w:p ns2:paraId="09E412A6" ns2:textId="77777777">
       <w:pPr>
         <w:pStyle w:val="BodyText"/>
         <w:spacing w:before="2"/>
         <w:ind w:left="540"/>
       </w:pPr>
       <w:r>
-        <w:t>Jane Doe</w:t>
-      </w:r>
-    </w:p>
-    <w:p>
+        <w:t>{Treas}</w:t>
+      </w:r>
+    </w:p>
+    <w:p ns2:paraId="0DAC25E0" ns2:textId="77777777">
       <w:pPr>
         <w:pStyle w:val="BodyText"/>
         <w:rPr>
@@ -324,7 +324,7 @@
         </w:rPr>
       </w:pPr>
     </w:p>
-    <w:p>
+    <w:p ns2:paraId="2035C55D" ns2:textId="77777777">
       <w:pPr>
         <w:pStyle w:val="Heading1"/>
         <w:spacing w:before="1" w:line="251" w:lineRule="exact"/>
@@ -336,17 +336,17 @@
         <w:t>Sergeant at Arms</w:t>
       </w:r>
     </w:p>
-    <w:p>
+    <w:p ns2:paraId="49E14319" ns2:textId="77777777">
       <w:pPr>
         <w:pStyle w:val="BodyText"/>
         <w:spacing w:line="251" w:lineRule="exact"/>
         <w:ind w:left="540"/>
       </w:pPr>
       <w:r>
-        <w:t>John Doe</w:t>
-      </w:r>
-    </w:p>
-    <w:p>
+        <w:t>{SAA}</w:t>
+      </w:r>
+    </w:p>
+    <w:p ns2:paraId="61D7E667" ns2:textId="77777777">
       <w:pPr>
         <w:pStyle w:val="BodyText"/>
         <w:rPr>
@@ -354,7 +354,7 @@
         </w:rPr>
       </w:pPr>
     </w:p>
-    <w:p>
+    <w:p ns2:paraId="32AEF2D5" ns2:textId="77777777">
       <w:pPr>
         <w:pStyle w:val="BodyText"/>
         <w:spacing w:before="1"/>
@@ -363,27 +363,27 @@
         </w:rPr>
       </w:pPr>
     </w:p>
-    <w:p>
+    <w:p ns2:paraId="7CA6A10E" ns2:textId="77777777">
       <w:pPr>
         <w:pStyle w:val="BodyText"/>
         <w:spacing w:line="242" w:lineRule="auto"/>
         <w:ind w:left="540" w:right="1034"/>
       </w:pPr>
       <w:r>
-        <w:t>We meet every day of the week</w:t>
-      </w:r>
-    </w:p>
-    <w:p>
+        <w:t>We meet {Days}</w:t>
+      </w:r>
+    </w:p>
+    <w:p ns2:paraId="1F7D8176" ns2:textId="77777777">
       <w:pPr>
         <w:pStyle w:val="BodyText"/>
         <w:spacing w:line="247" w:lineRule="exact"/>
         <w:ind w:left="540"/>
       </w:pPr>
       <w:r>
-        <w:t>from 00:00 to 00:00</w:t>
-      </w:r>
-    </w:p>
-    <w:p>
+        <w:t>from {Start} to {End}</w:t>
+      </w:r>
+    </w:p>
+    <w:p ns2:paraId="2CDC4A95" ns2:textId="77777777">
       <w:pPr>
         <w:pStyle w:val="BodyText"/>
         <w:spacing w:before="4"/>
@@ -392,7 +392,7 @@
         </w:rPr>
       </w:pPr>
     </w:p>
-    <w:p>
+    <w:p ns2:paraId="1A26113F" ns2:textId="0E86135B">
       <w:pPr>
         <w:pStyle w:val="BodyText"/>
         <w:spacing w:line="242" w:lineRule="auto"/>
@@ -401,15 +401,17 @@
       <w:r>
         <w:t xml:space="preserve">Location can be found on our website </w:t>
       </w:r>
-      <w:r>
-        <w:rPr>
-          <w:color w:val="0000FF"/>
-          <w:u w:val="single" w:color="0000FF"/>
-        </w:rPr>
-        <w:t>www.oursite.org</w:t>
-      </w:r>
-    </w:p>
-    <w:p>
+      <w:hyperlink r:id="rIdAgendaClubWebsite">
+        <w:r>
+          <w:rPr>
+            <w:color w:val="0000FF"/>
+            <w:u w:val="single" w:color="0000FF"/>
+          </w:rPr>
+          <w:t>{Website}</w:t>
+        </w:r>
+      </w:hyperlink>
+    </w:p>
+    <w:p ns2:paraId="41704C91" ns2:textId="77777777">
       <w:pPr>
         <w:pStyle w:val="BodyText"/>
         <w:spacing w:before="2"/>
@@ -418,7 +420,7 @@
         </w:rPr>
       </w:pPr>
     </w:p>
-    <w:p>
+    <w:p ns2:paraId="0C3636BD" ns2:textId="77777777">
       <w:pPr>
         <w:pStyle w:val="BodyText"/>
         <w:ind w:left="540" w:right="398"/>
@@ -436,7 +438,7 @@
         </w:r>
       </w:hyperlink>
     </w:p>
-    <w:p>
+    <w:p ns2:paraId="16DE9EE5" ns2:textId="77777777">
       <w:pPr>
         <w:pStyle w:val="BodyText"/>
         <w:rPr>
@@ -444,7 +446,7 @@
         </w:rPr>
       </w:pPr>
     </w:p>
-    <w:p>
+    <w:p ns2:paraId="75826D70" ns2:textId="77777777">
       <w:pPr>
         <w:pStyle w:val="BodyText"/>
         <w:spacing w:before="6"/>
@@ -453,7 +455,7 @@
         </w:rPr>
       </w:pPr>
     </w:p>
-    <w:p>
+    <w:p ns2:paraId="27AD4F02" ns2:textId="77777777">
       <w:pPr>
         <w:pStyle w:val="Heading1"/>
         <w:spacing w:line="251" w:lineRule="exact"/>
@@ -462,7 +464,7 @@
         <w:t>Club Mission</w:t>
       </w:r>
     </w:p>
-    <w:p>
+    <w:p ns2:paraId="3EBCDA2A" ns2:textId="77777777">
       <w:pPr>
         <w:pStyle w:val="BodyText"/>
         <w:ind w:left="540" w:right="19"/>
@@ -471,7 +473,7 @@
         <w:t>We provide a supportive and positive learning experience in which members are empowered to develop communication and leadership skills, resulting in greater</w:t>
       </w:r>
     </w:p>
-    <w:p>
+    <w:p ns2:paraId="6E0A604F" ns2:textId="77777777">
       <w:pPr>
         <w:pStyle w:val="BodyText"/>
         <w:spacing w:line="242" w:lineRule="auto"/>
@@ -481,7 +483,7 @@
         <w:t>self-confidence and personal growth.</w:t>
       </w:r>
     </w:p>
-    <w:p>
+    <w:p ns2:paraId="1F1DBBD9" ns2:textId="77777777">
       <w:pPr>
         <w:tabs>
           <w:tab w:val="left" w:pos="1260"/>
@@ -498,7 +500,7 @@
         <w:rPr>
           <w:b/>
         </w:rPr>
-        <w:t>7:00</w:t>
+        <w:t>{Start}</w:t>
       </w:r>
       <w:r>
         <w:rPr>
@@ -540,7 +542,7 @@
         <w:tab/>
       </w:r>
       <w:r>
-        <w:t>John Doe Chair’s</w:t>
+        <w:t>{Chair} Chair’s</w:t>
       </w:r>
       <w:r>
         <w:rPr>
@@ -556,24 +558,24 @@
       </w:r>
       <w:r>
         <w:tab/>
-        <w:t>John</w:t>
+        <w:t>{Chair}</w:t>
       </w:r>
       <w:r>
         <w:rPr>
           <w:spacing w:val="2"/>
         </w:rPr>
-        <w:t xml:space="preserve"> </w:t>
+        <w:t xml:space="preserve"/>
       </w:r>
       <w:r>
         <w:rPr>
           <w:spacing w:val="-8"/>
         </w:rPr>
-        <w:t>Doe</w:t>
+        <w:t/>
       </w:r>
       <w:bookmarkStart w:id="0" w:name="_GoBack"/>
       <w:bookmarkEnd w:id="0"/>
     </w:p>
-    <w:p>
+    <w:p ns2:paraId="52BC4521" ns2:textId="77777777">
       <w:pPr>
         <w:pStyle w:val="BodyText"/>
         <w:tabs>
@@ -587,77 +589,77 @@
         <w:rPr>
           <w:noProof/>
         </w:rPr>
-        <mc:AlternateContent>
-          <mc:Choice Requires="wps">
+        <ns1:AlternateContent>
+          <ns1:Choice Requires="wps">
             <w:drawing>
-              <wp:anchor distT="0" distB="0" distL="114300" distR="114300" simplePos="0" relativeHeight="1072" behindDoc="0" locked="0" layoutInCell="1" allowOverlap="1" wp14:anchorId="72B0F850">
-                <wp:simplePos x="0" y="0"/>
-                <wp:positionH relativeFrom="page">
-                  <wp:posOffset>2323465</wp:posOffset>
-                </wp:positionH>
-                <wp:positionV relativeFrom="paragraph">
-                  <wp:posOffset>-323850</wp:posOffset>
-                </wp:positionV>
-                <wp:extent cx="0" cy="7705090"/>
-                <wp:effectExtent l="0" t="0" r="0" b="3810"/>
-                <wp:wrapNone/>
-                <wp:docPr id="2" name="Line 3"/>
-                <wp:cNvGraphicFramePr>
-                  <a:graphicFrameLocks xmlns:a="http://schemas.openxmlformats.org/drawingml/2006/main"/>
-                </wp:cNvGraphicFramePr>
-                <a:graphic xmlns:a="http://schemas.openxmlformats.org/drawingml/2006/main">
-                  <a:graphicData uri="http://schemas.microsoft.com/office/word/2010/wordprocessingShape">
-                    <wps:wsp>
-                      <wps:cNvCnPr>
-                        <a:cxnSpLocks/>
-                      </wps:cNvCnPr>
-                      <wps:spPr bwMode="auto">
-                        <a:xfrm>
-                          <a:off x="0" y="0"/>
-                          <a:ext cx="0" cy="7705090"/>
-                        </a:xfrm>
-                        <a:prstGeom prst="line">
-                          <a:avLst/>
-                        </a:prstGeom>
-                        <a:noFill/>
-                        <a:ln w="9525">
-                          <a:solidFill>
-                            <a:srgbClr val="000000"/>
-                          </a:solidFill>
-                          <a:round/>
-                          <a:headEnd/>
-                          <a:tailEnd/>
-                        </a:ln>
-                        <a:extLst>
-                          <a:ext uri="{909E8E84-426E-40DD-AFC4-6F175D3DCCD1}">
-                            <a14:hiddenFill xmlns:a14="http://schemas.microsoft.com/office/drawing/2010/main">
-                              <a:noFill/>
-                            </a14:hiddenFill>
-                          </a:ext>
-                        </a:extLst>
-                      </wps:spPr>
-                      <wps:bodyPr/>
-                    </wps:wsp>
-                  </a:graphicData>
-                </a:graphic>
-                <wp14:sizeRelH relativeFrom="page">
-                  <wp14:pctWidth>0</wp14:pctWidth>
-                </wp14:sizeRelH>
-                <wp14:sizeRelV relativeFrom="page">
-                  <wp14:pctHeight>0</wp14:pctHeight>
-                </wp14:sizeRelV>
-              </wp:anchor>
+              <ns4:anchor distT="0" distB="0" distL="114300" distR="114300" simplePos="0" relativeHeight="1072" behindDoc="0" locked="0" layoutInCell="1" allowOverlap="1" ns5:anchorId="72B0F850">
+                <ns4:simplePos x="0" y="0"/>
+                <ns4:positionH relativeFrom="page">
+                  <ns4:posOffset>2323465</ns4:posOffset>
+                </ns4:positionH>
+                <ns4:positionV relativeFrom="paragraph">
+                  <ns4:posOffset>-323850</ns4:posOffset>
+                </ns4:positionV>
+                <ns4:extent cx="0" cy="7705090"/>
+                <ns4:effectExtent l="0" t="0" r="0" b="3810"/>
+                <ns4:wrapNone/>
+                <ns4:docPr id="2" name="Line 3"/>
+                <ns4:cNvGraphicFramePr>
+                  <ns6:graphicFrameLocks/>
+                </ns4:cNvGraphicFramePr>
+                <ns6:graphic>
+                  <ns6:graphicData uri="http://schemas.microsoft.com/office/word/2010/wordprocessingShape">
+                    <ns7:wsp>
+                      <ns7:cNvCnPr>
+                        <ns6:cxnSpLocks/>
+                      </ns7:cNvCnPr>
+                      <ns7:spPr bwMode="auto">
+                        <ns6:xfrm>
+                          <ns6:off x="0" y="0"/>
+                          <ns6:ext cx="0" cy="7705090"/>
+                        </ns6:xfrm>
+                        <ns6:prstGeom prst="line">
+                          <ns6:avLst/>
+                        </ns6:prstGeom>
+                        <ns6:noFill/>
+                        <ns6:ln w="9525">
+                          <ns6:solidFill>
+                            <ns6:srgbClr val="000000"/>
+                          </ns6:solidFill>
+                          <ns6:round/>
+                          <ns6:headEnd/>
+                          <ns6:tailEnd/>
+                        </ns6:ln>
+                        <ns6:extLst>
+                          <ns6:ext uri="{909E8E84-426E-40DD-AFC4-6F175D3DCCD1}">
+                            <ns8:hiddenFill>
+                              <ns6:noFill/>
+                            </ns8:hiddenFill>
+                          </ns6:ext>
+                        </ns6:extLst>
+                      </ns7:spPr>
+                      <ns7:bodyPr/>
+                    </ns7:wsp>
+                  </ns6:graphicData>
+                </ns6:graphic>
+                <ns5:sizeRelH relativeFrom="page">
+                  <ns5:pctWidth>0</ns5:pctWidth>
+                </ns5:sizeRelH>
+                <ns5:sizeRelV relativeFrom="page">
+                  <ns5:pctHeight>0</ns5:pctHeight>
+                </ns5:sizeRelV>
+              </ns4:anchor>
             </w:drawing>
-          </mc:Choice>
-          <mc:Fallback>
+          </ns1:Choice>
+          <ns1:Fallback>
             <w:pict>
-              <v:line w14:anchorId="3293F4A2" id="Line 3" o:spid="_x0000_s1026" style="position:absolute;z-index:1072;visibility:visible;mso-wrap-style:square;mso-width-percent:0;mso-height-percent:0;mso-wrap-distance-left:9pt;mso-wrap-distance-top:0;mso-wrap-distance-right:9pt;mso-wrap-distance-bottom:0;mso-position-horizontal:absolute;mso-position-horizontal-relative:page;mso-position-vertical:absolute;mso-position-vertical-relative:text;mso-width-percent:0;mso-height-percent:0;mso-width-relative:page;mso-height-relative:page" from="182.95pt,-25.5pt" to="182.95pt,581.2pt" o:gfxdata="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">
-                <o:lock v:ext="edit" shapetype="f"/>
-                <w10:wrap anchorx="page"/>
-              </v:line>
+              <ns9:line ns2:anchorId="3293F4A2" id="Line 3" ns10:spid="_x0000_s1026" style="position:absolute;z-index:1072;visibility:visible;mso-wrap-style:square;mso-width-percent:0;mso-height-percent:0;mso-wrap-distance-left:9pt;mso-wrap-distance-top:0;mso-wrap-distance-right:9pt;mso-wrap-distance-bottom:0;mso-position-horizontal:absolute;mso-position-horizontal-relative:page;mso-position-vertical:absolute;mso-position-vertical-relative:text;mso-width-percent:0;mso-height-percent:0;mso-width-relative:page;mso-height-relative:page" from="182.95pt,-25.5pt" to="182.95pt,581.2pt" ns10:gfxdata="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">
+                <ns10:lock ns9:ext="edit" shapetype="f"/>
+                <ns11:wrap anchorx="page"/>
+              </ns9:line>
             </w:pict>
-          </mc:Fallback>
-        </mc:AlternateContent>
+          </ns1:Fallback>
+        </ns1:AlternateContent>
       </w:r>
       <w:r>
         <w:t>Invocation and</w:t>
@@ -682,19 +684,19 @@
       </w:r>
       <w:r>
         <w:tab/>
-        <w:t>John</w:t>
+        <w:t>{Inv}</w:t>
       </w:r>
       <w:r>
         <w:rPr>
           <w:spacing w:val="-3"/>
         </w:rPr>
-        <w:t xml:space="preserve"> </w:t>
-      </w:r>
-      <w:r>
-        <w:t>Doe</w:t>
-      </w:r>
-    </w:p>
-    <w:p>
+        <w:t xml:space="preserve"/>
+      </w:r>
+      <w:r>
+        <w:t/>
+      </w:r>
+    </w:p>
+    <w:p ns2:paraId="1BB4DFE7" ns2:textId="77777777">
       <w:pPr>
         <w:pStyle w:val="BodyText"/>
         <w:tabs>
@@ -718,19 +720,19 @@
       </w:r>
       <w:r>
         <w:tab/>
-        <w:t>Jane</w:t>
+        <w:t>{Guest}</w:t>
       </w:r>
       <w:r>
         <w:rPr>
           <w:spacing w:val="-3"/>
         </w:rPr>
-        <w:t xml:space="preserve"> </w:t>
-      </w:r>
-      <w:r>
-        <w:t>Doe</w:t>
-      </w:r>
-    </w:p>
-    <w:p>
+        <w:t xml:space="preserve"/>
+      </w:r>
+      <w:r>
+        <w:t/>
+      </w:r>
+    </w:p>
+    <w:p ns2:paraId="04FE5D64" ns2:textId="77777777">
       <w:pPr>
         <w:pStyle w:val="BodyText"/>
         <w:spacing w:before="5"/>
@@ -739,7 +741,7 @@
         </w:rPr>
       </w:pPr>
     </w:p>
-    <w:p>
+    <w:p ns2:paraId="2D5168D8" ns2:textId="77777777">
       <w:pPr>
         <w:pStyle w:val="Heading1"/>
         <w:tabs>
@@ -747,7 +749,7 @@
         </w:tabs>
       </w:pPr>
       <w:r>
-        <w:t>7:05</w:t>
+        <w:t>{T1}</w:t>
       </w:r>
       <w:r>
         <w:tab/>
@@ -772,7 +774,7 @@
         <w:t>Day</w:t>
       </w:r>
     </w:p>
-    <w:p>
+    <w:p ns2:paraId="2730040E" ns2:textId="77777777">
       <w:pPr>
         <w:pStyle w:val="BodyText"/>
         <w:tabs>
@@ -805,19 +807,19 @@
       </w:r>
       <w:r>
         <w:tab/>
-        <w:t>Jane</w:t>
+        <w:t>{TM}</w:t>
       </w:r>
       <w:r>
         <w:rPr>
           <w:spacing w:val="1"/>
         </w:rPr>
-        <w:t xml:space="preserve"> </w:t>
-      </w:r>
-      <w:r>
-        <w:t>Doe</w:t>
-      </w:r>
-    </w:p>
-    <w:p>
+        <w:t xml:space="preserve"/>
+      </w:r>
+      <w:r>
+        <w:t/>
+      </w:r>
+    </w:p>
+    <w:p ns2:paraId="781861E7" ns2:textId="77777777">
       <w:pPr>
         <w:pStyle w:val="BodyText"/>
         <w:tabs>
@@ -850,13 +852,13 @@
       </w:r>
       <w:r>
         <w:tab/>
-        <w:t xml:space="preserve">John </w:t>
+        <w:t xml:space="preserve">{Joke}</w:t>
       </w:r>
       <w:r>
         <w:rPr>
           <w:spacing w:val="-8"/>
         </w:rPr>
-        <w:t xml:space="preserve">Doe </w:t>
+        <w:t xml:space="preserve"> </w:t>
       </w:r>
       <w:r>
         <w:t>Returns control to the Toastmaster of the</w:t>
@@ -871,7 +873,7 @@
         <w:t>Day</w:t>
       </w:r>
     </w:p>
-    <w:p>
+    <w:p ns2:paraId="5A70CC6F" ns2:textId="77777777">
       <w:pPr>
         <w:pStyle w:val="BodyText"/>
         <w:rPr>
@@ -879,7 +881,7 @@
         </w:rPr>
       </w:pPr>
     </w:p>
-    <w:p>
+    <w:p ns2:paraId="345F9F5B" ns2:textId="77777777">
       <w:pPr>
         <w:pStyle w:val="Heading1"/>
         <w:tabs>
@@ -887,7 +889,7 @@
         </w:tabs>
       </w:pPr>
       <w:r>
-        <w:t>7:10</w:t>
+        <w:t>{T2}</w:t>
       </w:r>
       <w:r>
         <w:tab/>
@@ -903,7 +905,7 @@
         <w:t>Roles</w:t>
       </w:r>
     </w:p>
-    <w:p>
+    <w:p ns2:paraId="53714883" ns2:textId="77777777">
       <w:pPr>
         <w:pStyle w:val="BodyText"/>
         <w:tabs>
@@ -918,19 +920,19 @@
       </w:r>
       <w:r>
         <w:tab/>
-        <w:t>Jane</w:t>
+        <w:t>{Ah}</w:t>
       </w:r>
       <w:r>
         <w:rPr>
           <w:spacing w:val="-4"/>
         </w:rPr>
-        <w:t xml:space="preserve"> </w:t>
-      </w:r>
-      <w:r>
-        <w:t>Doe</w:t>
-      </w:r>
-    </w:p>
-    <w:p>
+        <w:t xml:space="preserve"/>
+      </w:r>
+      <w:r>
+        <w:t/>
+      </w:r>
+    </w:p>
+    <w:p ns2:paraId="3BF7BD5B" ns2:textId="77777777">
       <w:pPr>
         <w:pStyle w:val="BodyText"/>
         <w:tabs>
@@ -945,19 +947,19 @@
       </w:r>
       <w:r>
         <w:tab/>
-        <w:t>Jane</w:t>
+        <w:t>{Gram}</w:t>
       </w:r>
       <w:r>
         <w:rPr>
           <w:spacing w:val="-4"/>
         </w:rPr>
-        <w:t xml:space="preserve"> </w:t>
-      </w:r>
-      <w:r>
-        <w:t>Doe</w:t>
-      </w:r>
-    </w:p>
-    <w:p>
+        <w:t xml:space="preserve"/>
+      </w:r>
+      <w:r>
+        <w:t/>
+      </w:r>
+    </w:p>
+    <w:p ns2:paraId="2A2817E3" ns2:textId="77777777">
       <w:pPr>
         <w:pStyle w:val="BodyText"/>
         <w:tabs>
@@ -972,19 +974,19 @@
       </w:r>
       <w:r>
         <w:tab/>
-        <w:t>Jane</w:t>
+        <w:t>{Timer}</w:t>
       </w:r>
       <w:r>
         <w:rPr>
           <w:spacing w:val="-4"/>
         </w:rPr>
-        <w:t xml:space="preserve"> </w:t>
-      </w:r>
-      <w:r>
-        <w:t>Doe</w:t>
-      </w:r>
-    </w:p>
-    <w:p>
+        <w:t xml:space="preserve"/>
+      </w:r>
+      <w:r>
+        <w:t/>
+      </w:r>
+    </w:p>
+    <w:p ns2:paraId="5F293269" ns2:textId="77777777">
       <w:pPr>
         <w:pStyle w:val="BodyText"/>
         <w:tabs>
@@ -1008,19 +1010,19 @@
       </w:r>
       <w:r>
         <w:tab/>
-        <w:t>John</w:t>
+        <w:t>{GE}</w:t>
       </w:r>
       <w:r>
         <w:rPr>
           <w:spacing w:val="-3"/>
         </w:rPr>
-        <w:t xml:space="preserve"> </w:t>
-      </w:r>
-      <w:r>
-        <w:t>Doe</w:t>
-      </w:r>
-    </w:p>
-    <w:p>
+        <w:t xml:space="preserve"/>
+      </w:r>
+      <w:r>
+        <w:t/>
+      </w:r>
+    </w:p>
+    <w:p ns2:paraId="4A7FC2E8" ns2:textId="77777777">
       <w:pPr>
         <w:pStyle w:val="BodyText"/>
         <w:tabs>
@@ -1044,19 +1046,19 @@
       </w:r>
       <w:r>
         <w:tab/>
-        <w:t>Jane</w:t>
+        <w:t>{Eval1}</w:t>
       </w:r>
       <w:r>
         <w:rPr>
           <w:spacing w:val="-3"/>
         </w:rPr>
-        <w:t xml:space="preserve"> </w:t>
-      </w:r>
-      <w:r>
-        <w:t>Doe</w:t>
-      </w:r>
-    </w:p>
-    <w:p>
+        <w:t xml:space="preserve"/>
+      </w:r>
+      <w:r>
+        <w:t/>
+      </w:r>
+    </w:p>
+    <w:p ns2:paraId="2265132D" ns2:textId="77777777">
       <w:pPr>
         <w:pStyle w:val="BodyText"/>
         <w:tabs>
@@ -1071,19 +1073,19 @@
       </w:r>
       <w:r>
         <w:tab/>
-        <w:t>John</w:t>
+        <w:t>{Eval2}</w:t>
       </w:r>
       <w:r>
         <w:rPr>
           <w:spacing w:val="-3"/>
         </w:rPr>
-        <w:t xml:space="preserve"> </w:t>
-      </w:r>
-      <w:r>
-        <w:t>Doe</w:t>
-      </w:r>
-    </w:p>
-    <w:p>
+        <w:t xml:space="preserve"/>
+      </w:r>
+      <w:r>
+        <w:t/>
+      </w:r>
+    </w:p>
+    <w:p ns2:paraId="1A9D7779" ns2:textId="77777777">
       <w:pPr>
         <w:pStyle w:val="BodyText"/>
         <w:tabs>
@@ -1107,19 +1109,19 @@
       </w:r>
       <w:r>
         <w:tab/>
-        <w:t>Jane</w:t>
+        <w:t>{Eval3}</w:t>
       </w:r>
       <w:r>
         <w:rPr>
           <w:spacing w:val="-3"/>
         </w:rPr>
-        <w:t xml:space="preserve"> </w:t>
-      </w:r>
-      <w:r>
-        <w:t>Doe</w:t>
-      </w:r>
-    </w:p>
-    <w:p>
+        <w:t xml:space="preserve"/>
+      </w:r>
+      <w:r>
+        <w:t/>
+      </w:r>
+    </w:p>
+    <w:p ns2:paraId="25FD136F" ns2:textId="77777777">
       <w:pPr>
         <w:pStyle w:val="BodyText"/>
         <w:spacing w:before="9"/>
@@ -1128,7 +1130,7 @@
         </w:rPr>
       </w:pPr>
     </w:p>
-    <w:p>
+    <w:p ns2:paraId="78DF3ED2" ns2:textId="77777777">
       <w:pPr>
         <w:pStyle w:val="Heading1"/>
         <w:tabs>
@@ -1137,7 +1139,7 @@
         <w:spacing w:line="251" w:lineRule="exact"/>
       </w:pPr>
       <w:r>
-        <w:t>7:17</w:t>
+        <w:t>{T3}</w:t>
       </w:r>
       <w:r>
         <w:tab/>
@@ -1153,7 +1155,7 @@
         <w:t>Speakers</w:t>
       </w:r>
     </w:p>
-    <w:p>
+    <w:p ns2:paraId="2779F2A8" ns2:textId="77777777">
       <w:pPr>
         <w:pStyle w:val="BodyText"/>
         <w:tabs>
@@ -1173,32 +1175,32 @@
         <w:t xml:space="preserve"> </w:t>
       </w:r>
       <w:r>
-        <w:t>(5-7</w:t>
+        <w:t>({S1 time}</w:t>
       </w:r>
       <w:r>
         <w:rPr>
           <w:spacing w:val="-4"/>
         </w:rPr>
-        <w:t xml:space="preserve"> </w:t>
-      </w:r>
-      <w:r>
-        <w:t>minutes)</w:t>
-      </w:r>
-      <w:r>
-        <w:tab/>
-        <w:t>Jane</w:t>
+        <w:t xml:space="preserve"/>
+      </w:r>
+      <w:r>
+        <w:t>)</w:t>
+      </w:r>
+      <w:r>
+        <w:tab/>
+        <w:t>{Spkr1}</w:t>
       </w:r>
       <w:r>
         <w:rPr>
           <w:spacing w:val="-4"/>
         </w:rPr>
-        <w:t xml:space="preserve"> </w:t>
-      </w:r>
-      <w:r>
-        <w:t>Doe</w:t>
-      </w:r>
-    </w:p>
-    <w:p>
+        <w:t xml:space="preserve"/>
+      </w:r>
+      <w:r>
+        <w:t/>
+      </w:r>
+    </w:p>
+    <w:p ns2:paraId="0C5ECDF5" ns2:textId="77777777">
       <w:pPr>
         <w:pStyle w:val="BodyText"/>
         <w:tabs>
@@ -1218,32 +1220,32 @@
         <w:t xml:space="preserve"> </w:t>
       </w:r>
       <w:r>
-        <w:t>(4-6</w:t>
+        <w:t>({S2 time}</w:t>
       </w:r>
       <w:r>
         <w:rPr>
           <w:spacing w:val="-1"/>
         </w:rPr>
-        <w:t xml:space="preserve"> </w:t>
-      </w:r>
-      <w:r>
-        <w:t>minutes)</w:t>
-      </w:r>
-      <w:r>
-        <w:tab/>
-        <w:t>Jane</w:t>
+        <w:t xml:space="preserve"/>
+      </w:r>
+      <w:r>
+        <w:t>)</w:t>
+      </w:r>
+      <w:r>
+        <w:tab/>
+        <w:t>{Spkr2}</w:t>
       </w:r>
       <w:r>
         <w:rPr>
           <w:spacing w:val="-3"/>
         </w:rPr>
-        <w:t xml:space="preserve"> </w:t>
-      </w:r>
-      <w:r>
-        <w:t>Doe</w:t>
-      </w:r>
-    </w:p>
-    <w:p>
+        <w:t xml:space="preserve"/>
+      </w:r>
+      <w:r>
+        <w:t/>
+      </w:r>
+    </w:p>
+    <w:p ns2:paraId="2C0FE8F3" ns2:textId="77777777">
       <w:pPr>
         <w:pStyle w:val="BodyText"/>
         <w:tabs>
@@ -1263,32 +1265,32 @@
         <w:t xml:space="preserve"> </w:t>
       </w:r>
       <w:r>
-        <w:t>(5-7</w:t>
+        <w:t>({S3 time}</w:t>
       </w:r>
       <w:r>
         <w:rPr>
           <w:spacing w:val="-1"/>
         </w:rPr>
-        <w:t xml:space="preserve"> </w:t>
-      </w:r>
-      <w:r>
-        <w:t>minutes)</w:t>
-      </w:r>
-      <w:r>
-        <w:tab/>
-        <w:t>John</w:t>
+        <w:t xml:space="preserve"/>
+      </w:r>
+      <w:r>
+        <w:t>)</w:t>
+      </w:r>
+      <w:r>
+        <w:tab/>
+        <w:t>{Spkr3}</w:t>
       </w:r>
       <w:r>
         <w:rPr>
           <w:spacing w:val="-3"/>
         </w:rPr>
-        <w:t xml:space="preserve"> </w:t>
-      </w:r>
-      <w:r>
-        <w:t>Doe</w:t>
-      </w:r>
-    </w:p>
-    <w:p>
+        <w:t xml:space="preserve"/>
+      </w:r>
+      <w:r>
+        <w:t/>
+      </w:r>
+    </w:p>
+    <w:p ns2:paraId="79688DE9" ns2:textId="77777777">
       <w:pPr>
         <w:pStyle w:val="BodyText"/>
         <w:tabs>
@@ -1321,13 +1323,13 @@
       </w:r>
       <w:r>
         <w:tab/>
-        <w:t xml:space="preserve">Jane </w:t>
+        <w:t xml:space="preserve">{Timer}</w:t>
       </w:r>
       <w:r>
         <w:rPr>
           <w:spacing w:val="-8"/>
         </w:rPr>
-        <w:t xml:space="preserve">Doe </w:t>
+        <w:t xml:space="preserve"> </w:t>
       </w:r>
       <w:r>
         <w:t>Recap Speakers and Give Reminder to</w:t>
@@ -1342,7 +1344,7 @@
         <w:t>Vote</w:t>
       </w:r>
     </w:p>
-    <w:p>
+    <w:p ns2:paraId="3B192978" ns2:textId="77777777">
       <w:pPr>
         <w:pStyle w:val="BodyText"/>
         <w:spacing w:before="4"/>
@@ -1351,7 +1353,7 @@
         </w:rPr>
       </w:pPr>
     </w:p>
-    <w:p>
+    <w:p ns2:paraId="4F58A3F4" ns2:textId="77777777">
       <w:pPr>
         <w:tabs>
           <w:tab w:val="left" w:pos="1260"/>
@@ -1364,7 +1366,7 @@
         <w:rPr>
           <w:b/>
         </w:rPr>
-        <w:t>7:40</w:t>
+        <w:t>{T4}</w:t>
       </w:r>
       <w:r>
         <w:rPr>
@@ -1408,13 +1410,13 @@
         <w:tab/>
       </w:r>
       <w:r>
-        <w:t xml:space="preserve">Jane </w:t>
+        <w:t xml:space="preserve">{Topics}</w:t>
       </w:r>
       <w:r>
         <w:rPr>
           <w:spacing w:val="-8"/>
         </w:rPr>
-        <w:t xml:space="preserve">Doe </w:t>
+        <w:t xml:space="preserve"> </w:t>
       </w:r>
       <w:r>
         <w:t>Conduct Table Topics</w:t>
@@ -1429,7 +1431,7 @@
         <w:t>Session</w:t>
       </w:r>
     </w:p>
-    <w:p>
+    <w:p ns2:paraId="1696ACCC" ns2:textId="77777777">
       <w:pPr>
         <w:pStyle w:val="BodyText"/>
         <w:tabs>
@@ -1462,13 +1464,13 @@
       </w:r>
       <w:r>
         <w:tab/>
-        <w:t xml:space="preserve">Jane </w:t>
+        <w:t xml:space="preserve">{Timer}</w:t>
       </w:r>
       <w:r>
         <w:rPr>
           <w:spacing w:val="-8"/>
         </w:rPr>
-        <w:t xml:space="preserve">Doe </w:t>
+        <w:t xml:space="preserve"> </w:t>
       </w:r>
       <w:r>
         <w:t>Recap Speakers and Give Reminder to</w:t>
@@ -1483,7 +1485,7 @@
         <w:t>Vote</w:t>
       </w:r>
     </w:p>
-    <w:p>
+    <w:p ns2:paraId="2D6FC9D4" ns2:textId="77777777">
       <w:pPr>
         <w:pStyle w:val="BodyText"/>
         <w:spacing w:before="35"/>
@@ -1493,7 +1495,7 @@
         <w:t>Returns control to the Toastmaster of the Day</w:t>
       </w:r>
     </w:p>
-    <w:p>
+    <w:p ns2:paraId="349E9AF0" ns2:textId="77777777">
       <w:pPr>
         <w:pStyle w:val="BodyText"/>
         <w:spacing w:before="4"/>
@@ -1502,7 +1504,7 @@
         </w:rPr>
       </w:pPr>
     </w:p>
-    <w:p>
+    <w:p ns2:paraId="43AAC99F" ns2:textId="77777777">
       <w:pPr>
         <w:pStyle w:val="Heading1"/>
         <w:tabs>
@@ -1514,7 +1516,7 @@
         </w:rPr>
       </w:pPr>
       <w:r>
-        <w:t>8:05</w:t>
+        <w:t>{T5}</w:t>
       </w:r>
       <w:r>
         <w:tab/>
@@ -1545,29 +1547,29 @@
         <w:rPr>
           <w:b w:val="0"/>
         </w:rPr>
-        <w:t>Jane</w:t>
+        <w:t>{TM}</w:t>
       </w:r>
       <w:r>
         <w:rPr>
           <w:b w:val="0"/>
           <w:spacing w:val="-3"/>
         </w:rPr>
-        <w:t xml:space="preserve"> </w:t>
+        <w:t xml:space="preserve"/>
       </w:r>
       <w:r>
         <w:rPr>
           <w:b w:val="0"/>
         </w:rPr>
-        <w:t>Doe</w:t>
-      </w:r>
-    </w:p>
-    <w:p>
+        <w:t/>
+      </w:r>
+    </w:p>
+    <w:p ns2:paraId="0A05A9D6" ns2:textId="77777777">
       <w:pPr>
         <w:pStyle w:val="BodyText"/>
         <w:spacing w:before="4"/>
       </w:pPr>
     </w:p>
-    <w:p>
+    <w:p ns2:paraId="16513EC0" ns2:textId="77777777">
       <w:pPr>
         <w:tabs>
           <w:tab w:val="left" w:pos="1260"/>
@@ -1580,7 +1582,7 @@
         <w:rPr>
           <w:b/>
         </w:rPr>
-        <w:t>8:05</w:t>
+        <w:t>{T6}</w:t>
       </w:r>
       <w:r>
         <w:rPr>
@@ -1622,19 +1624,19 @@
         <w:tab/>
       </w:r>
       <w:r>
-        <w:t>John</w:t>
+        <w:t>{GE}</w:t>
       </w:r>
       <w:r>
         <w:rPr>
           <w:spacing w:val="-4"/>
         </w:rPr>
-        <w:t xml:space="preserve"> </w:t>
-      </w:r>
-      <w:r>
-        <w:t>Doe</w:t>
-      </w:r>
-    </w:p>
-    <w:p>
+        <w:t xml:space="preserve"/>
+      </w:r>
+      <w:r>
+        <w:t/>
+      </w:r>
+    </w:p>
+    <w:p ns2:paraId="45E11495" ns2:textId="77777777">
       <w:pPr>
         <w:pStyle w:val="BodyText"/>
         <w:spacing w:before="10"/>
@@ -1643,7 +1645,7 @@
         </w:rPr>
       </w:pPr>
     </w:p>
-    <w:p>
+    <w:p ns2:paraId="66DF60E2" ns2:textId="77777777">
       <w:pPr>
         <w:pStyle w:val="BodyText"/>
         <w:tabs>
@@ -1662,26 +1664,26 @@
         <w:t xml:space="preserve"> </w:t>
       </w:r>
       <w:r>
-        <w:t>(2-3</w:t>
+        <w:t>({E1 time}</w:t>
       </w:r>
       <w:r>
         <w:rPr>
           <w:spacing w:val="1"/>
         </w:rPr>
-        <w:t xml:space="preserve"> </w:t>
-      </w:r>
-      <w:r>
-        <w:t>Minutes)</w:t>
-      </w:r>
-      <w:r>
-        <w:tab/>
-        <w:t xml:space="preserve">Jane </w:t>
+        <w:t xml:space="preserve"/>
+      </w:r>
+      <w:r>
+        <w:t>)</w:t>
+      </w:r>
+      <w:r>
+        <w:tab/>
+        <w:t xml:space="preserve">{Eval1}</w:t>
       </w:r>
       <w:r>
         <w:rPr>
           <w:spacing w:val="-8"/>
         </w:rPr>
-        <w:t xml:space="preserve">Doe </w:t>
+        <w:t xml:space="preserve"> </w:t>
       </w:r>
       <w:r>
         <w:t>Second Speaker’s Evaluation</w:t>
@@ -1693,26 +1695,26 @@
         <w:t xml:space="preserve"> </w:t>
       </w:r>
       <w:r>
-        <w:t>(2-3</w:t>
+        <w:t>({E2 time}</w:t>
       </w:r>
       <w:r>
         <w:rPr>
           <w:spacing w:val="-1"/>
         </w:rPr>
-        <w:t xml:space="preserve"> </w:t>
-      </w:r>
-      <w:r>
-        <w:t>Minutes)</w:t>
-      </w:r>
-      <w:r>
-        <w:tab/>
-        <w:t xml:space="preserve">John </w:t>
+        <w:t xml:space="preserve"/>
+      </w:r>
+      <w:r>
+        <w:t>)</w:t>
+      </w:r>
+      <w:r>
+        <w:tab/>
+        <w:t xml:space="preserve">{Eval2}</w:t>
       </w:r>
       <w:r>
         <w:rPr>
           <w:spacing w:val="-8"/>
         </w:rPr>
-        <w:t xml:space="preserve">Doe </w:t>
+        <w:t xml:space="preserve"> </w:t>
       </w:r>
       <w:r>
         <w:t>Third Speaker’s Evaluation</w:t>
@@ -1724,26 +1726,26 @@
         <w:t xml:space="preserve"> </w:t>
       </w:r>
       <w:r>
-        <w:t>(2-3</w:t>
+        <w:t>({E3 time}</w:t>
       </w:r>
       <w:r>
         <w:rPr>
           <w:spacing w:val="-1"/>
         </w:rPr>
-        <w:t xml:space="preserve"> </w:t>
-      </w:r>
-      <w:r>
-        <w:t>Minutes)</w:t>
-      </w:r>
-      <w:r>
-        <w:tab/>
-        <w:t xml:space="preserve">Jane </w:t>
+        <w:t xml:space="preserve"/>
+      </w:r>
+      <w:r>
+        <w:t>)</w:t>
+      </w:r>
+      <w:r>
+        <w:tab/>
+        <w:t xml:space="preserve">{Eval3}</w:t>
       </w:r>
       <w:r>
         <w:rPr>
           <w:spacing w:val="-8"/>
         </w:rPr>
-        <w:t xml:space="preserve">Doe </w:t>
+        <w:t xml:space="preserve"> </w:t>
       </w:r>
       <w:r>
         <w:t>Recap Evaluators and Call for Submission of</w:t>
@@ -1758,7 +1760,7 @@
         <w:t>Votes</w:t>
       </w:r>
     </w:p>
-    <w:p>
+    <w:p ns2:paraId="2294A641" ns2:textId="77777777">
       <w:pPr>
         <w:jc w:val="both"/>
         <w:sectPr>
@@ -1772,7 +1774,7 @@
         </w:sectPr>
       </w:pPr>
     </w:p>
-    <w:p>
+    <w:p ns2:paraId="3BBAD186" ns2:textId="27E22935">
       <w:pPr>
         <w:pStyle w:val="BodyText"/>
         <w:ind w:left="119"/>
@@ -1781,7 +1783,7 @@
         </w:rPr>
       </w:pPr>
     </w:p>
-    <w:p>
+    <w:p ns2:paraId="2A53A082" ns2:textId="77613EAE">
       <w:pPr>
         <w:pStyle w:val="BodyText"/>
         <w:ind w:left="119"/>
@@ -1790,7 +1792,7 @@
         </w:rPr>
       </w:pPr>
     </w:p>
-    <w:p>
+    <w:p ns2:paraId="68AE9A76" ns2:textId="0D688773">
       <w:pPr>
         <w:pStyle w:val="BodyText"/>
         <w:ind w:left="119"/>
@@ -1799,7 +1801,7 @@
         </w:rPr>
       </w:pPr>
     </w:p>
-    <w:p>
+    <w:p ns2:paraId="7E20ED70" ns2:textId="5041D766">
       <w:pPr>
         <w:pStyle w:val="BodyText"/>
         <w:ind w:left="119"/>
@@ -1808,7 +1810,7 @@
         </w:rPr>
       </w:pPr>
     </w:p>
-    <w:p>
+    <w:p ns2:paraId="08F14BAF" ns2:textId="2BF13412">
       <w:pPr>
         <w:pStyle w:val="BodyText"/>
         <w:ind w:left="119"/>
@@ -1817,7 +1819,7 @@
         </w:rPr>
       </w:pPr>
     </w:p>
-    <w:p>
+    <w:p ns2:paraId="5F67528E" ns2:textId="19D6FE62">
       <w:pPr>
         <w:pStyle w:val="BodyText"/>
         <w:ind w:left="119"/>
@@ -1826,7 +1828,7 @@
         </w:rPr>
       </w:pPr>
     </w:p>
-    <w:p>
+    <w:p ns2:paraId="67E9C58C" ns2:textId="04DC41BC">
       <w:pPr>
         <w:pStyle w:val="BodyText"/>
         <w:ind w:left="119"/>
@@ -1835,7 +1837,7 @@
         </w:rPr>
       </w:pPr>
     </w:p>
-    <w:p>
+    <w:p ns2:paraId="10D27A14" ns2:textId="77777777">
       <w:pPr>
         <w:pStyle w:val="BodyText"/>
         <w:ind w:left="119"/>
@@ -1844,7 +1846,7 @@
         </w:rPr>
       </w:pPr>
     </w:p>
-    <w:p>
+    <w:p ns2:paraId="0904C738" ns2:textId="77777777">
       <w:pPr>
         <w:pStyle w:val="BodyText"/>
         <w:rPr>
@@ -1852,7 +1854,7 @@
         </w:rPr>
       </w:pPr>
     </w:p>
-    <w:p>
+    <w:p ns2:paraId="175B520A" ns2:textId="77777777">
       <w:pPr>
         <w:rPr>
           <w:sz w:val="20"/>
@@ -1864,7 +1866,7 @@
         </w:sectPr>
       </w:pPr>
     </w:p>
-    <w:p>
+    <w:p ns2:paraId="256700EF" ns2:textId="77777777">
       <w:pPr>
         <w:pStyle w:val="BodyText"/>
         <w:spacing w:before="6"/>
@@ -1873,7 +1875,7 @@
         </w:rPr>
       </w:pPr>
     </w:p>
-    <w:p>
+    <w:p ns2:paraId="7B9B863F" ns2:textId="77777777">
       <w:pPr>
         <w:pStyle w:val="Heading1"/>
         <w:spacing w:line="251" w:lineRule="exact"/>
@@ -1887,17 +1889,17 @@
         <w:t>President</w:t>
       </w:r>
     </w:p>
-    <w:p>
+    <w:p ns2:paraId="187A0C49" ns2:textId="77777777">
       <w:pPr>
         <w:pStyle w:val="BodyText"/>
         <w:spacing w:line="251" w:lineRule="exact"/>
         <w:ind w:left="540"/>
       </w:pPr>
       <w:r>
-        <w:t>John Doe</w:t>
-      </w:r>
-    </w:p>
-    <w:p>
+        <w:t>{Pres}</w:t>
+      </w:r>
+    </w:p>
+    <w:p ns2:paraId="1D36077E" ns2:textId="77777777">
       <w:pPr>
         <w:pStyle w:val="BodyText"/>
         <w:rPr>
@@ -1905,7 +1907,7 @@
         </w:rPr>
       </w:pPr>
     </w:p>
-    <w:p>
+    <w:p ns2:paraId="3CCA1E60" ns2:textId="77777777">
       <w:pPr>
         <w:pStyle w:val="Heading1"/>
       </w:pPr>
@@ -1918,17 +1920,17 @@
         <w:t>VP Education</w:t>
       </w:r>
     </w:p>
-    <w:p>
+    <w:p ns2:paraId="30FC2C28" ns2:textId="77777777">
       <w:pPr>
         <w:pStyle w:val="BodyText"/>
         <w:spacing w:before="3"/>
         <w:ind w:left="540"/>
       </w:pPr>
       <w:r>
-        <w:t>John Doe</w:t>
-      </w:r>
-    </w:p>
-    <w:p>
+        <w:t>{VPE}</w:t>
+      </w:r>
+    </w:p>
+    <w:p ns2:paraId="5536C7DB" ns2:textId="77777777">
       <w:pPr>
         <w:pStyle w:val="BodyText"/>
         <w:spacing w:before="7"/>
@@ -1937,7 +1939,7 @@
         </w:rPr>
       </w:pPr>
     </w:p>
-    <w:p>
+    <w:p ns2:paraId="319E07C8" ns2:textId="77777777">
       <w:pPr>
         <w:pStyle w:val="Heading1"/>
       </w:pPr>
@@ -1950,17 +1952,17 @@
         <w:t>VP Membership</w:t>
       </w:r>
     </w:p>
-    <w:p>
+    <w:p ns2:paraId="169D5ABA" ns2:textId="77777777">
       <w:pPr>
         <w:pStyle w:val="BodyText"/>
         <w:spacing w:before="2"/>
         <w:ind w:left="540"/>
       </w:pPr>
       <w:r>
-        <w:t>Jane Doe</w:t>
-      </w:r>
-    </w:p>
-    <w:p>
+        <w:t>{VPM}</w:t>
+      </w:r>
+    </w:p>
+    <w:p ns2:paraId="2DAE4798" ns2:textId="77777777">
       <w:pPr>
         <w:pStyle w:val="BodyText"/>
         <w:spacing w:before="7"/>
@@ -1969,7 +1971,7 @@
         </w:rPr>
       </w:pPr>
     </w:p>
-    <w:p>
+    <w:p ns2:paraId="11FD6AA3" ns2:textId="77777777">
       <w:pPr>
         <w:pStyle w:val="Heading1"/>
       </w:pPr>
@@ -1982,17 +1984,17 @@
         <w:t>VP Public Relations</w:t>
       </w:r>
     </w:p>
-    <w:p>
+    <w:p ns2:paraId="41F0AF94" ns2:textId="77777777">
       <w:pPr>
         <w:pStyle w:val="BodyText"/>
         <w:spacing w:before="2"/>
         <w:ind w:left="540"/>
       </w:pPr>
       <w:r>
-        <w:t>Jane Doe</w:t>
-      </w:r>
-    </w:p>
-    <w:p>
+        <w:t>{VPPR}</w:t>
+      </w:r>
+    </w:p>
+    <w:p ns2:paraId="498C9BBA" ns2:textId="77777777">
       <w:pPr>
         <w:pStyle w:val="BodyText"/>
         <w:spacing w:before="1"/>
@@ -2001,7 +2003,7 @@
         </w:rPr>
       </w:pPr>
     </w:p>
-    <w:p>
+    <w:p ns2:paraId="323F1C0B" ns2:textId="77777777">
       <w:pPr>
         <w:pStyle w:val="Heading1"/>
         <w:spacing w:line="251" w:lineRule="exact"/>
@@ -2015,17 +2017,17 @@
         <w:t>Secretary</w:t>
       </w:r>
     </w:p>
-    <w:p>
+    <w:p ns2:paraId="3A2393EF" ns2:textId="77777777">
       <w:pPr>
         <w:pStyle w:val="BodyText"/>
         <w:spacing w:line="251" w:lineRule="exact"/>
         <w:ind w:left="540"/>
       </w:pPr>
       <w:r>
-        <w:t>John Doe</w:t>
-      </w:r>
-    </w:p>
-    <w:p>
+        <w:t>{Sec}</w:t>
+      </w:r>
+    </w:p>
+    <w:p ns2:paraId="01EF0BAC" ns2:textId="77777777">
       <w:pPr>
         <w:pStyle w:val="BodyText"/>
         <w:rPr>
@@ -2033,7 +2035,7 @@
         </w:rPr>
       </w:pPr>
     </w:p>
-    <w:p>
+    <w:p ns2:paraId="4A9F82C7" ns2:textId="77777777">
       <w:pPr>
         <w:pStyle w:val="Heading1"/>
         <w:spacing w:before="1" w:line="251" w:lineRule="exact"/>
@@ -2047,17 +2049,17 @@
         <w:t>Treasurer</w:t>
       </w:r>
     </w:p>
-    <w:p>
+    <w:p ns2:paraId="6468D619" ns2:textId="77777777">
       <w:pPr>
         <w:pStyle w:val="BodyText"/>
         <w:spacing w:line="251" w:lineRule="exact"/>
         <w:ind w:left="540"/>
       </w:pPr>
       <w:r>
-        <w:t>Jane Doe</w:t>
-      </w:r>
-    </w:p>
-    <w:p>
+        <w:t>{Treas}</w:t>
+      </w:r>
+    </w:p>
+    <w:p ns2:paraId="24EA6AB4" ns2:textId="77777777">
       <w:pPr>
         <w:pStyle w:val="BodyText"/>
         <w:rPr>
@@ -2065,7 +2067,7 @@
         </w:rPr>
       </w:pPr>
     </w:p>
-    <w:p>
+    <w:p ns2:paraId="500C4B43" ns2:textId="77777777">
       <w:pPr>
         <w:pStyle w:val="Heading1"/>
         <w:spacing w:before="1"/>
@@ -2079,17 +2081,17 @@
         <w:t>Sergeant at Arms</w:t>
       </w:r>
     </w:p>
-    <w:p>
+    <w:p ns2:paraId="02B03B4F" ns2:textId="77777777">
       <w:pPr>
         <w:pStyle w:val="BodyText"/>
         <w:spacing w:before="2"/>
         <w:ind w:left="540"/>
       </w:pPr>
       <w:r>
-        <w:t>John Doe</w:t>
-      </w:r>
-    </w:p>
-    <w:p>
+        <w:t>{SAA}</w:t>
+      </w:r>
+    </w:p>
+    <w:p ns2:paraId="3DE003BE" ns2:textId="77777777">
       <w:pPr>
         <w:pStyle w:val="BodyText"/>
         <w:rPr>
@@ -2097,7 +2099,7 @@
         </w:rPr>
       </w:pPr>
     </w:p>
-    <w:p>
+    <w:p ns2:paraId="55FC52C9" ns2:textId="77777777">
       <w:pPr>
         <w:pStyle w:val="BodyText"/>
         <w:spacing w:before="1"/>
@@ -2106,27 +2108,27 @@
         </w:rPr>
       </w:pPr>
     </w:p>
-    <w:p>
+    <w:p ns2:paraId="4C00D3CB" ns2:textId="77777777">
       <w:pPr>
         <w:pStyle w:val="BodyText"/>
         <w:spacing w:line="237" w:lineRule="auto"/>
         <w:ind w:left="540" w:right="645"/>
       </w:pPr>
       <w:r>
-        <w:t>We meet every day of the week</w:t>
-      </w:r>
-    </w:p>
-    <w:p>
+        <w:t>We meet {Days}</w:t>
+      </w:r>
+    </w:p>
+    <w:p ns2:paraId="56C9E65D" ns2:textId="77777777">
       <w:pPr>
         <w:pStyle w:val="BodyText"/>
         <w:spacing w:before="3"/>
         <w:ind w:left="540"/>
       </w:pPr>
       <w:r>
-        <w:t>from 00:00 to 00:00</w:t>
-      </w:r>
-    </w:p>
-    <w:p>
+        <w:t>from {Start} to {End}</w:t>
+      </w:r>
+    </w:p>
+    <w:p ns2:paraId="1A9772E7" ns2:textId="77777777">
       <w:pPr>
         <w:pStyle w:val="BodyText"/>
         <w:spacing w:before="1"/>
@@ -2135,7 +2137,7 @@
         </w:rPr>
       </w:pPr>
     </w:p>
-    <w:p>
+    <w:p ns2:paraId="3F1FB7B9" ns2:textId="6FB6806D">
       <w:pPr>
         <w:pStyle w:val="BodyText"/>
         <w:spacing w:line="242" w:lineRule="auto"/>
@@ -2144,15 +2146,17 @@
       <w:r>
         <w:t xml:space="preserve">Location can be found on our website </w:t>
       </w:r>
-      <w:r>
-        <w:rPr>
-          <w:color w:val="0000FF"/>
-          <w:u w:val="single" w:color="0000FF"/>
-        </w:rPr>
-        <w:t>www.oursite.org</w:t>
-      </w:r>
-    </w:p>
-    <w:p>
+      <w:hyperlink r:id="rIdAgendaClubWebsite">
+        <w:r>
+          <w:rPr>
+            <w:color w:val="0000FF"/>
+            <w:u w:val="single" w:color="0000FF"/>
+          </w:rPr>
+          <w:t>{Website}</w:t>
+        </w:r>
+      </w:hyperlink>
+    </w:p>
+    <w:p ns2:paraId="3ED809B3" ns2:textId="77777777">
       <w:pPr>
         <w:pStyle w:val="BodyText"/>
         <w:spacing w:before="6"/>
@@ -2164,7 +2168,7 @@
         <w:br w:type="column"/>
       </w:r>
     </w:p>
-    <w:p>
+    <w:p ns2:paraId="00F8FB89" ns2:textId="77777777">
       <w:pPr>
         <w:pStyle w:val="Heading1"/>
         <w:tabs>
@@ -2173,7 +2177,7 @@
         <w:spacing w:line="251" w:lineRule="exact"/>
       </w:pPr>
       <w:r>
-        <w:t>8:11</w:t>
+        <w:t>{T7}</w:t>
       </w:r>
       <w:r>
         <w:tab/>
@@ -2189,7 +2193,7 @@
         <w:t>Reports</w:t>
       </w:r>
     </w:p>
-    <w:p>
+    <w:p ns2:paraId="6AD672A3" ns2:textId="77777777">
       <w:pPr>
         <w:pStyle w:val="BodyText"/>
         <w:tabs>
@@ -2202,96 +2206,96 @@
         <w:rPr>
           <w:noProof/>
         </w:rPr>
-        <mc:AlternateContent>
-          <mc:Choice Requires="wps">
+        <ns1:AlternateContent>
+          <ns1:Choice Requires="wps">
             <w:drawing>
-              <wp:anchor distT="0" distB="0" distL="114300" distR="114300" simplePos="0" relativeHeight="1096" behindDoc="0" locked="0" layoutInCell="1" allowOverlap="1" wp14:anchorId="5BE55A1C">
-                <wp:simplePos x="0" y="0"/>
-                <wp:positionH relativeFrom="page">
-                  <wp:posOffset>2332990</wp:posOffset>
-                </wp:positionH>
-                <wp:positionV relativeFrom="paragraph">
-                  <wp:posOffset>-161925</wp:posOffset>
-                </wp:positionV>
-                <wp:extent cx="0" cy="8028305"/>
-                <wp:effectExtent l="0" t="0" r="0" b="0"/>
-                <wp:wrapNone/>
-                <wp:docPr id="1" name="Line 2"/>
-                <wp:cNvGraphicFramePr>
-                  <a:graphicFrameLocks xmlns:a="http://schemas.openxmlformats.org/drawingml/2006/main"/>
-                </wp:cNvGraphicFramePr>
-                <a:graphic xmlns:a="http://schemas.openxmlformats.org/drawingml/2006/main">
-                  <a:graphicData uri="http://schemas.microsoft.com/office/word/2010/wordprocessingShape">
-                    <wps:wsp>
-                      <wps:cNvCnPr>
-                        <a:cxnSpLocks/>
-                      </wps:cNvCnPr>
-                      <wps:spPr bwMode="auto">
-                        <a:xfrm>
-                          <a:off x="0" y="0"/>
-                          <a:ext cx="0" cy="8028305"/>
-                        </a:xfrm>
-                        <a:prstGeom prst="line">
-                          <a:avLst/>
-                        </a:prstGeom>
-                        <a:noFill/>
-                        <a:ln w="9525">
-                          <a:solidFill>
-                            <a:srgbClr val="000000"/>
-                          </a:solidFill>
-                          <a:round/>
-                          <a:headEnd/>
-                          <a:tailEnd/>
-                        </a:ln>
-                        <a:extLst>
-                          <a:ext uri="{909E8E84-426E-40DD-AFC4-6F175D3DCCD1}">
-                            <a14:hiddenFill xmlns:a14="http://schemas.microsoft.com/office/drawing/2010/main">
-                              <a:noFill/>
-                            </a14:hiddenFill>
-                          </a:ext>
-                        </a:extLst>
-                      </wps:spPr>
-                      <wps:bodyPr/>
-                    </wps:wsp>
-                  </a:graphicData>
-                </a:graphic>
-                <wp14:sizeRelH relativeFrom="page">
-                  <wp14:pctWidth>0</wp14:pctWidth>
-                </wp14:sizeRelH>
-                <wp14:sizeRelV relativeFrom="page">
-                  <wp14:pctHeight>0</wp14:pctHeight>
-                </wp14:sizeRelV>
-              </wp:anchor>
+              <ns4:anchor distT="0" distB="0" distL="114300" distR="114300" simplePos="0" relativeHeight="1096" behindDoc="0" locked="0" layoutInCell="1" allowOverlap="1" ns5:anchorId="5BE55A1C">
+                <ns4:simplePos x="0" y="0"/>
+                <ns4:positionH relativeFrom="page">
+                  <ns4:posOffset>2332990</ns4:posOffset>
+                </ns4:positionH>
+                <ns4:positionV relativeFrom="paragraph">
+                  <ns4:posOffset>-161925</ns4:posOffset>
+                </ns4:positionV>
+                <ns4:extent cx="0" cy="8028305"/>
+                <ns4:effectExtent l="0" t="0" r="0" b="0"/>
+                <ns4:wrapNone/>
+                <ns4:docPr id="1" name="Line 2"/>
+                <ns4:cNvGraphicFramePr>
+                  <ns6:graphicFrameLocks/>
+                </ns4:cNvGraphicFramePr>
+                <ns6:graphic>
+                  <ns6:graphicData uri="http://schemas.microsoft.com/office/word/2010/wordprocessingShape">
+                    <ns7:wsp>
+                      <ns7:cNvCnPr>
+                        <ns6:cxnSpLocks/>
+                      </ns7:cNvCnPr>
+                      <ns7:spPr bwMode="auto">
+                        <ns6:xfrm>
+                          <ns6:off x="0" y="0"/>
+                          <ns6:ext cx="0" cy="8028305"/>
+                        </ns6:xfrm>
+                        <ns6:prstGeom prst="line">
+                          <ns6:avLst/>
+                        </ns6:prstGeom>
+                        <ns6:noFill/>
+                        <ns6:ln w="9525">
+                          <ns6:solidFill>
+                            <ns6:srgbClr val="000000"/>
+                          </ns6:solidFill>
+                          <ns6:round/>
+                          <ns6:headEnd/>
+                          <ns6:tailEnd/>
+                        </ns6:ln>
+                        <ns6:extLst>
+                          <ns6:ext uri="{909E8E84-426E-40DD-AFC4-6F175D3DCCD1}">
+                            <ns8:hiddenFill>
+                              <ns6:noFill/>
+                            </ns8:hiddenFill>
+                          </ns6:ext>
+                        </ns6:extLst>
+                      </ns7:spPr>
+                      <ns7:bodyPr/>
+                    </ns7:wsp>
+                  </ns6:graphicData>
+                </ns6:graphic>
+                <ns5:sizeRelH relativeFrom="page">
+                  <ns5:pctWidth>0</ns5:pctWidth>
+                </ns5:sizeRelH>
+                <ns5:sizeRelV relativeFrom="page">
+                  <ns5:pctHeight>0</ns5:pctHeight>
+                </ns5:sizeRelV>
+              </ns4:anchor>
             </w:drawing>
-          </mc:Choice>
-          <mc:Fallback>
+          </ns1:Choice>
+          <ns1:Fallback>
             <w:pict>
-              <v:line w14:anchorId="4B2184C1" id="Line 2" o:spid="_x0000_s1026" style="position:absolute;z-index:1096;visibility:visible;mso-wrap-style:square;mso-width-percent:0;mso-height-percent:0;mso-wrap-distance-left:9pt;mso-wrap-distance-top:0;mso-wrap-distance-right:9pt;mso-wrap-distance-bottom:0;mso-position-horizontal:absolute;mso-position-horizontal-relative:page;mso-position-vertical:absolute;mso-position-vertical-relative:text;mso-width-percent:0;mso-height-percent:0;mso-width-relative:page;mso-height-relative:page" from="183.7pt,-12.75pt" to="183.7pt,619.4pt" o:gfxdata="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">
-                <o:lock v:ext="edit" shapetype="f"/>
-                <w10:wrap anchorx="page"/>
-              </v:line>
+              <ns9:line ns2:anchorId="4B2184C1" id="Line 2" ns10:spid="_x0000_s1026" style="position:absolute;z-index:1096;visibility:visible;mso-wrap-style:square;mso-width-percent:0;mso-height-percent:0;mso-wrap-distance-left:9pt;mso-wrap-distance-top:0;mso-wrap-distance-right:9pt;mso-wrap-distance-bottom:0;mso-position-horizontal:absolute;mso-position-horizontal-relative:page;mso-position-vertical:absolute;mso-position-vertical-relative:text;mso-width-percent:0;mso-height-percent:0;mso-width-relative:page;mso-height-relative:page" from="183.7pt,-12.75pt" to="183.7pt,619.4pt" ns10:gfxdata="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">
+                <ns10:lock ns9:ext="edit" shapetype="f"/>
+                <ns11:wrap anchorx="page"/>
+              </ns9:line>
             </w:pict>
-          </mc:Fallback>
-        </mc:AlternateContent>
+          </ns1:Fallback>
+        </ns1:AlternateContent>
       </w:r>
       <w:r>
         <w:t>Timer</w:t>
       </w:r>
       <w:r>
         <w:tab/>
-        <w:t>Jane</w:t>
+        <w:t>{Timer}</w:t>
       </w:r>
       <w:r>
         <w:rPr>
           <w:spacing w:val="-4"/>
         </w:rPr>
-        <w:t xml:space="preserve"> </w:t>
-      </w:r>
-      <w:r>
-        <w:t>Doe</w:t>
-      </w:r>
-    </w:p>
-    <w:p>
+        <w:t xml:space="preserve"/>
+      </w:r>
+      <w:r>
+        <w:t/>
+      </w:r>
+    </w:p>
+    <w:p ns2:paraId="3FF8B613" ns2:textId="77777777">
       <w:pPr>
         <w:pStyle w:val="BodyText"/>
         <w:tabs>
@@ -2305,19 +2309,19 @@
       </w:r>
       <w:r>
         <w:tab/>
-        <w:t>Jane</w:t>
+        <w:t>{Ah}</w:t>
       </w:r>
       <w:r>
         <w:rPr>
           <w:spacing w:val="-4"/>
         </w:rPr>
-        <w:t xml:space="preserve"> </w:t>
-      </w:r>
-      <w:r>
-        <w:t>Doe</w:t>
-      </w:r>
-    </w:p>
-    <w:p>
+        <w:t xml:space="preserve"/>
+      </w:r>
+      <w:r>
+        <w:t/>
+      </w:r>
+    </w:p>
+    <w:p ns2:paraId="436DDAA2" ns2:textId="77777777">
       <w:pPr>
         <w:pStyle w:val="BodyText"/>
         <w:tabs>
@@ -2331,25 +2335,25 @@
       </w:r>
       <w:r>
         <w:tab/>
-        <w:t>Jane</w:t>
+        <w:t>{Gram}</w:t>
       </w:r>
       <w:r>
         <w:rPr>
           <w:spacing w:val="-4"/>
         </w:rPr>
-        <w:t xml:space="preserve"> </w:t>
-      </w:r>
-      <w:r>
-        <w:t>Doe</w:t>
-      </w:r>
-    </w:p>
-    <w:p>
+        <w:t xml:space="preserve"/>
+      </w:r>
+      <w:r>
+        <w:t/>
+      </w:r>
+    </w:p>
+    <w:p ns2:paraId="6869499F" ns2:textId="77777777">
       <w:pPr>
         <w:pStyle w:val="BodyText"/>
         <w:spacing w:before="1"/>
       </w:pPr>
     </w:p>
-    <w:p>
+    <w:p ns2:paraId="2A3A519F" ns2:textId="77777777">
       <w:pPr>
         <w:tabs>
           <w:tab w:val="left" w:pos="1260"/>
@@ -2362,7 +2366,7 @@
         <w:rPr>
           <w:b/>
         </w:rPr>
-        <w:t>8:14</w:t>
+        <w:t>{T8}</w:t>
       </w:r>
       <w:r>
         <w:rPr>
@@ -2404,13 +2408,13 @@
         <w:tab/>
       </w:r>
       <w:r>
-        <w:t xml:space="preserve">John </w:t>
+        <w:t xml:space="preserve">{GE}</w:t>
       </w:r>
       <w:r>
         <w:rPr>
           <w:spacing w:val="-8"/>
         </w:rPr>
-        <w:t xml:space="preserve">Doe </w:t>
+        <w:t xml:space="preserve"> </w:t>
       </w:r>
       <w:r>
         <w:t>General Evaluator provides meeting</w:t>
@@ -2425,7 +2429,7 @@
         <w:t>&amp;</w:t>
       </w:r>
     </w:p>
-    <w:p>
+    <w:p ns2:paraId="1A5A1A14" ns2:textId="77777777">
       <w:pPr>
         <w:pStyle w:val="BodyText"/>
         <w:spacing w:before="2"/>
@@ -2435,7 +2439,7 @@
         <w:t>leader evaluations</w:t>
       </w:r>
     </w:p>
-    <w:p>
+    <w:p ns2:paraId="0DA73887" ns2:textId="77777777">
       <w:pPr>
         <w:pStyle w:val="BodyText"/>
         <w:spacing w:before="2"/>
@@ -2445,12 +2449,12 @@
         <w:t>Returns control to the Toastmaster of the Day</w:t>
       </w:r>
     </w:p>
-    <w:p>
-      <w:pPr>
-        <w:pStyle w:val="BodyText"/>
-      </w:pPr>
-    </w:p>
-    <w:p>
+    <w:p ns2:paraId="63303C8D" ns2:textId="77777777">
+      <w:pPr>
+        <w:pStyle w:val="BodyText"/>
+      </w:pPr>
+    </w:p>
+    <w:p ns2:paraId="4C8FDF30" ns2:textId="77777777">
       <w:pPr>
         <w:tabs>
           <w:tab w:val="left" w:pos="1260"/>
@@ -2463,7 +2467,7 @@
         <w:rPr>
           <w:b/>
         </w:rPr>
-        <w:t>8:17</w:t>
+        <w:t>{T9}</w:t>
       </w:r>
       <w:r>
         <w:rPr>
@@ -2505,13 +2509,13 @@
         <w:tab/>
       </w:r>
       <w:r>
-        <w:t xml:space="preserve">John </w:t>
+        <w:t xml:space="preserve">{TM}</w:t>
       </w:r>
       <w:r>
         <w:rPr>
           <w:spacing w:val="-8"/>
         </w:rPr>
-        <w:t xml:space="preserve">Doe </w:t>
+        <w:t xml:space="preserve"> </w:t>
       </w:r>
       <w:r>
         <w:t>Best</w:t>
@@ -2526,7 +2530,7 @@
         <w:t>Evaluator</w:t>
       </w:r>
     </w:p>
-    <w:p>
+    <w:p ns2:paraId="467218D7" ns2:textId="77777777">
       <w:pPr>
         <w:pStyle w:val="BodyText"/>
         <w:spacing w:before="2"/>
@@ -2536,7 +2540,7 @@
         <w:t>Best Table Topics Best Speaker Special Awards</w:t>
       </w:r>
     </w:p>
-    <w:p>
+    <w:p ns2:paraId="222FD93B" ns2:textId="77777777">
       <w:pPr>
         <w:pStyle w:val="BodyText"/>
         <w:spacing w:before="1"/>
@@ -2546,7 +2550,7 @@
         <w:t>Returns control to the Chair of the meeting</w:t>
       </w:r>
     </w:p>
-    <w:p>
+    <w:p ns2:paraId="20AD8035" ns2:textId="77777777">
       <w:pPr>
         <w:pStyle w:val="Heading1"/>
         <w:tabs>
@@ -2556,11 +2560,11 @@
         <w:ind w:right="4075"/>
       </w:pPr>
       <w:r>
-        <w:t>8:20</w:t>
-      </w:r>
-      <w:r>
-        <w:tab/>
-        <w:t>Chair Leads Club Business 8:45</w:t>
+        <w:t>{T10}</w:t>
+      </w:r>
+      <w:r>
+        <w:tab/>
+        <w:t>Chair Leads Club Business {End}</w:t>
       </w:r>
       <w:r>
         <w:tab/>
@@ -2576,7 +2580,7 @@
         <w:t>Meeting</w:t>
       </w:r>
     </w:p>
-    <w:p>
+    <w:p ns2:paraId="3B1C2794" ns2:textId="77777777">
       <w:pPr>
         <w:spacing w:line="480" w:lineRule="auto"/>
         <w:sectPr>
@@ -2590,7 +2594,7 @@
         </w:sectPr>
       </w:pPr>
     </w:p>
-    <w:p>
+    <w:p ns2:paraId="422726B1" ns2:textId="77777777">
       <w:pPr>
         <w:pStyle w:val="BodyText"/>
         <w:spacing w:before="9"/>
@@ -2600,7 +2604,7 @@
         </w:rPr>
       </w:pPr>
     </w:p>
-    <w:p>
+    <w:p ns2:paraId="73042A8A" ns2:textId="77777777">
       <w:pPr>
         <w:pStyle w:val="BodyText"/>
         <w:spacing w:before="93" w:line="242" w:lineRule="auto"/>

</xml_diff>